<commit_message>
License: "DM, CA CSLB GC 714639" in every master + corrected at generation
David, Nov 1 2026: the license printed in the reports was wrong ("DM CA GC 714639").
- 7 masters (Final, Final Repairs, Final Upon Completion .docm, Review, Invasive signature
  page, Unsafe Conditions, WICR Final): text-only change in word/document.xml (dropdown list
  items, displayed text, |PREV=| macro tag, Unsafe letter run); every other zip entry
  byte-identical. Rendered with LibreOffice to confirm.
- clientFormEngine.applySigners: the live masters are blob-first (Master Forms uploads), so the
  old wording is also corrected at generation, whatever master is live; the Unsafe-letter swap
  matches both wordings. Tenants with their own signers are unchanged (only their list prints).

Co-Authored-By: Claude Opus 5.5 <noreply@anthropic.com>
Claude-Session: https://claude.ai/code/session_01E6jFYM79MEYJ5TgknDtNxo
</commit_message>
<xml_diff>
--- a/Deck_FinalRepairsMaster.docx
+++ b/Deck_FinalRepairsMaster.docx
@@ -11436,12 +11436,12 @@
             <w:rPr>
               <w:rFonts w:cstheme="minorHAnsi"/>
             </w:rPr>
-            <w:tag w:val="|PREV=DM CA GC 714639|"/>
+            <w:tag w:val="|PREV=DM, CA CSLB GC 714639|"/>
             <w:id w:val="-2135779939"/>
             <w:lock w:val="sdtLocked"/>
             <w:dropDownList>
               <w:listItem w:value="Choose an item."/>
-              <w:listItem w:displayText="DM CA GC 714639" w:value="DM CA GC 714639"/>
+              <w:listItem w:displayText="DM, CA CSLB GC 714639" w:value="DM, CA CSLB GC 714639"/>
               <w:listItem w:displayText="VS Architect CA - C13791" w:value="VS Architect CA - C13791"/>
               <w:listItem w:displayText="PK Architect CA- C 26488" w:value="PK Architect CA- C 26488"/>
               <w:listItem w:displayText="NA" w:value="NA"/>
@@ -11465,7 +11465,7 @@
                   <w:rPr>
                     <w:rFonts w:cstheme="minorHAnsi"/>
                   </w:rPr>
-                  <w:t>DM CA GC 714639</w:t>
+                  <w:t>DM, CA CSLB GC 714639</w:t>
                 </w:r>
               </w:p>
             </w:tc>

</xml_diff>

<commit_message>
License prints "CA CSLB GC 714639" (no "DM") - masters + generation correction
David, Nov 1 2026: "remove DM and just leave CA CSLB GC 714639". The 7 masters (text-only), the
generation-time correction for masters uploaded earlier, and the Unsafe-letter swap.

Co-Authored-By: Claude Opus 5.5 <noreply@anthropic.com>
Claude-Session: https://claude.ai/code/session_01E6jFYM79MEYJ5TgknDtNxo
</commit_message>
<xml_diff>
--- a/Deck_FinalRepairsMaster.docx
+++ b/Deck_FinalRepairsMaster.docx
@@ -11436,12 +11436,12 @@
             <w:rPr>
               <w:rFonts w:cstheme="minorHAnsi"/>
             </w:rPr>
-            <w:tag w:val="|PREV=DM, CA CSLB GC 714639|"/>
+            <w:tag w:val="|PREV=CA CSLB GC 714639|"/>
             <w:id w:val="-2135779939"/>
             <w:lock w:val="sdtLocked"/>
             <w:dropDownList>
               <w:listItem w:value="Choose an item."/>
-              <w:listItem w:displayText="DM, CA CSLB GC 714639" w:value="DM, CA CSLB GC 714639"/>
+              <w:listItem w:displayText="CA CSLB GC 714639" w:value="CA CSLB GC 714639"/>
               <w:listItem w:displayText="VS Architect CA - C13791" w:value="VS Architect CA - C13791"/>
               <w:listItem w:displayText="PK Architect CA- C 26488" w:value="PK Architect CA- C 26488"/>
               <w:listItem w:displayText="NA" w:value="NA"/>
@@ -11465,7 +11465,7 @@
                   <w:rPr>
                     <w:rFonts w:cstheme="minorHAnsi"/>
                   </w:rPr>
-                  <w:t>DM, CA CSLB GC 714639</w:t>
+                  <w:t>CA CSLB GC 714639</w:t>
                 </w:r>
               </w:p>
             </w:tc>

</xml_diff>